<commit_message>
add files to test
</commit_message>
<xml_diff>
--- a/lab-4/lab04_student.docx
+++ b/lab-4/lab04_student.docx
@@ -23,12 +23,6 @@
         <w:gridCol w:w="9360"/>
       </w:tblGrid>
       <w:tr>
-        <w:tblPrEx>
-          <w:tblCellMar>
-            <w:top w:w="0" w:type="dxa"/>
-            <w:bottom w:w="0" w:type="dxa"/>
-          </w:tblCellMar>
-        </w:tblPrEx>
         <w:tc>
           <w:tcPr>
             <w:tcW w:w="9360" w:type="dxa"/>
@@ -168,12 +162,6 @@
         <w:gridCol w:w="6960"/>
       </w:tblGrid>
       <w:tr>
-        <w:tblPrEx>
-          <w:tblCellMar>
-            <w:top w:w="0" w:type="dxa"/>
-            <w:bottom w:w="0" w:type="dxa"/>
-          </w:tblCellMar>
-        </w:tblPrEx>
         <w:tc>
           <w:tcPr>
             <w:tcW w:w="2400" w:type="dxa"/>
@@ -236,12 +224,6 @@
         </w:tc>
       </w:tr>
       <w:tr>
-        <w:tblPrEx>
-          <w:tblCellMar>
-            <w:top w:w="0" w:type="dxa"/>
-            <w:bottom w:w="0" w:type="dxa"/>
-          </w:tblCellMar>
-        </w:tblPrEx>
         <w:tc>
           <w:tcPr>
             <w:tcW w:w="2400" w:type="dxa"/>
@@ -336,12 +318,6 @@
         </w:tc>
       </w:tr>
       <w:tr>
-        <w:tblPrEx>
-          <w:tblCellMar>
-            <w:top w:w="0" w:type="dxa"/>
-            <w:bottom w:w="0" w:type="dxa"/>
-          </w:tblCellMar>
-        </w:tblPrEx>
         <w:tc>
           <w:tcPr>
             <w:tcW w:w="2400" w:type="dxa"/>
@@ -400,12 +376,6 @@
         </w:tc>
       </w:tr>
       <w:tr>
-        <w:tblPrEx>
-          <w:tblCellMar>
-            <w:top w:w="0" w:type="dxa"/>
-            <w:bottom w:w="0" w:type="dxa"/>
-          </w:tblCellMar>
-        </w:tblPrEx>
         <w:tc>
           <w:tcPr>
             <w:tcW w:w="2400" w:type="dxa"/>
@@ -458,42 +428,12 @@
                 <w:sz w:val="21"/>
                 <w:szCs w:val="21"/>
               </w:rPr>
-              <w:t>3</w:t>
-            </w:r>
-            <w:r>
-              <w:rPr>
-                <w:color w:val="000000"/>
-                <w:sz w:val="21"/>
-                <w:szCs w:val="21"/>
-              </w:rPr>
-              <w:t>–</w:t>
-            </w:r>
-            <w:r>
-              <w:rPr>
-                <w:color w:val="000000"/>
-                <w:sz w:val="21"/>
-                <w:szCs w:val="21"/>
-              </w:rPr>
-              <w:t>4</w:t>
-            </w:r>
-            <w:r>
-              <w:rPr>
-                <w:color w:val="000000"/>
-                <w:sz w:val="21"/>
-                <w:szCs w:val="21"/>
-              </w:rPr>
-              <w:t xml:space="preserve"> hours</w:t>
+              <w:t>3–4 hours</w:t>
             </w:r>
           </w:p>
         </w:tc>
       </w:tr>
       <w:tr>
-        <w:tblPrEx>
-          <w:tblCellMar>
-            <w:top w:w="0" w:type="dxa"/>
-            <w:bottom w:w="0" w:type="dxa"/>
-          </w:tblCellMar>
-        </w:tblPrEx>
         <w:tc>
           <w:tcPr>
             <w:tcW w:w="2400" w:type="dxa"/>
@@ -552,12 +492,6 @@
         </w:tc>
       </w:tr>
       <w:tr>
-        <w:tblPrEx>
-          <w:tblCellMar>
-            <w:top w:w="0" w:type="dxa"/>
-            <w:bottom w:w="0" w:type="dxa"/>
-          </w:tblCellMar>
-        </w:tblPrEx>
         <w:tc>
           <w:tcPr>
             <w:tcW w:w="2400" w:type="dxa"/>
@@ -616,12 +550,6 @@
         </w:tc>
       </w:tr>
       <w:tr>
-        <w:tblPrEx>
-          <w:tblCellMar>
-            <w:top w:w="0" w:type="dxa"/>
-            <w:bottom w:w="0" w:type="dxa"/>
-          </w:tblCellMar>
-        </w:tblPrEx>
         <w:tc>
           <w:tcPr>
             <w:tcW w:w="2400" w:type="dxa"/>
@@ -737,12 +665,6 @@
         <w:gridCol w:w="2560"/>
       </w:tblGrid>
       <w:tr>
-        <w:tblPrEx>
-          <w:tblCellMar>
-            <w:top w:w="0" w:type="dxa"/>
-            <w:bottom w:w="0" w:type="dxa"/>
-          </w:tblCellMar>
-        </w:tblPrEx>
         <w:tc>
           <w:tcPr>
             <w:tcW w:w="1400" w:type="dxa"/>
@@ -865,12 +787,6 @@
         </w:tc>
       </w:tr>
       <w:tr>
-        <w:tblPrEx>
-          <w:tblCellMar>
-            <w:top w:w="0" w:type="dxa"/>
-            <w:bottom w:w="0" w:type="dxa"/>
-          </w:tblCellMar>
-        </w:tblPrEx>
         <w:tc>
           <w:tcPr>
             <w:tcW w:w="1400" w:type="dxa"/>
@@ -995,12 +911,6 @@
         </w:tc>
       </w:tr>
       <w:tr>
-        <w:tblPrEx>
-          <w:tblCellMar>
-            <w:top w:w="0" w:type="dxa"/>
-            <w:bottom w:w="0" w:type="dxa"/>
-          </w:tblCellMar>
-        </w:tblPrEx>
         <w:tc>
           <w:tcPr>
             <w:tcW w:w="1400" w:type="dxa"/>
@@ -1117,12 +1027,6 @@
         </w:tc>
       </w:tr>
       <w:tr>
-        <w:tblPrEx>
-          <w:tblCellMar>
-            <w:top w:w="0" w:type="dxa"/>
-            <w:bottom w:w="0" w:type="dxa"/>
-          </w:tblCellMar>
-        </w:tblPrEx>
         <w:tc>
           <w:tcPr>
             <w:tcW w:w="1400" w:type="dxa"/>
@@ -1263,12 +1167,6 @@
         <w:gridCol w:w="9360"/>
       </w:tblGrid>
       <w:tr>
-        <w:tblPrEx>
-          <w:tblCellMar>
-            <w:top w:w="0" w:type="dxa"/>
-            <w:bottom w:w="0" w:type="dxa"/>
-          </w:tblCellMar>
-        </w:tblPrEx>
         <w:tc>
           <w:tcPr>
             <w:tcW w:w="9360" w:type="dxa"/>
@@ -1416,12 +1314,6 @@
         <w:gridCol w:w="9360"/>
       </w:tblGrid>
       <w:tr>
-        <w:tblPrEx>
-          <w:tblCellMar>
-            <w:top w:w="0" w:type="dxa"/>
-            <w:bottom w:w="0" w:type="dxa"/>
-          </w:tblCellMar>
-        </w:tblPrEx>
         <w:tc>
           <w:tcPr>
             <w:tcW w:w="9360" w:type="dxa"/>
@@ -1501,12 +1393,6 @@
         <w:gridCol w:w="2827"/>
       </w:tblGrid>
       <w:tr>
-        <w:tblPrEx>
-          <w:tblCellMar>
-            <w:top w:w="0" w:type="dxa"/>
-            <w:bottom w:w="0" w:type="dxa"/>
-          </w:tblCellMar>
-        </w:tblPrEx>
         <w:tc>
           <w:tcPr>
             <w:tcW w:w="1800" w:type="dxa"/>
@@ -1599,12 +1485,6 @@
         </w:tc>
       </w:tr>
       <w:tr>
-        <w:tblPrEx>
-          <w:tblCellMar>
-            <w:top w:w="0" w:type="dxa"/>
-            <w:bottom w:w="0" w:type="dxa"/>
-          </w:tblCellMar>
-        </w:tblPrEx>
         <w:tc>
           <w:tcPr>
             <w:tcW w:w="1800" w:type="dxa"/>
@@ -1691,12 +1571,6 @@
         </w:tc>
       </w:tr>
       <w:tr>
-        <w:tblPrEx>
-          <w:tblCellMar>
-            <w:top w:w="0" w:type="dxa"/>
-            <w:bottom w:w="0" w:type="dxa"/>
-          </w:tblCellMar>
-        </w:tblPrEx>
         <w:tc>
           <w:tcPr>
             <w:tcW w:w="1800" w:type="dxa"/>
@@ -1783,12 +1657,6 @@
         </w:tc>
       </w:tr>
       <w:tr>
-        <w:tblPrEx>
-          <w:tblCellMar>
-            <w:top w:w="0" w:type="dxa"/>
-            <w:bottom w:w="0" w:type="dxa"/>
-          </w:tblCellMar>
-        </w:tblPrEx>
         <w:tc>
           <w:tcPr>
             <w:tcW w:w="1800" w:type="dxa"/>
@@ -1875,12 +1743,6 @@
         </w:tc>
       </w:tr>
       <w:tr>
-        <w:tblPrEx>
-          <w:tblCellMar>
-            <w:top w:w="0" w:type="dxa"/>
-            <w:bottom w:w="0" w:type="dxa"/>
-          </w:tblCellMar>
-        </w:tblPrEx>
         <w:tc>
           <w:tcPr>
             <w:tcW w:w="1800" w:type="dxa"/>
@@ -2004,12 +1866,6 @@
         <w:gridCol w:w="9360"/>
       </w:tblGrid>
       <w:tr>
-        <w:tblPrEx>
-          <w:tblCellMar>
-            <w:top w:w="0" w:type="dxa"/>
-            <w:bottom w:w="0" w:type="dxa"/>
-          </w:tblCellMar>
-        </w:tblPrEx>
         <w:tc>
           <w:tcPr>
             <w:tcW w:w="9360" w:type="dxa"/>
@@ -2088,12 +1944,6 @@
         <w:gridCol w:w="9360"/>
       </w:tblGrid>
       <w:tr>
-        <w:tblPrEx>
-          <w:tblCellMar>
-            <w:top w:w="0" w:type="dxa"/>
-            <w:bottom w:w="0" w:type="dxa"/>
-          </w:tblCellMar>
-        </w:tblPrEx>
         <w:tc>
           <w:tcPr>
             <w:tcW w:w="9360" w:type="dxa"/>
@@ -2205,8 +2055,19 @@
                 <w:sz w:val="18"/>
                 <w:szCs w:val="18"/>
               </w:rPr>
-              <w:t xml:space="preserve"> student/  solution/  docker/  docs/  README.md</w:t>
-            </w:r>
+              <w:t xml:space="preserve"> student</w:t>
+            </w:r>
+            <w:proofErr w:type="gramStart"/>
+            <w:r>
+              <w:rPr>
+                <w:rFonts w:ascii="Courier New" w:eastAsia="Courier New" w:hAnsi="Courier New" w:cs="Courier New"/>
+                <w:color w:val="D4D4D4"/>
+                <w:sz w:val="18"/>
+                <w:szCs w:val="18"/>
+              </w:rPr>
+              <w:t>/  solution/  docker/  docs/  README.md</w:t>
+            </w:r>
+            <w:proofErr w:type="gramEnd"/>
           </w:p>
         </w:tc>
       </w:tr>
@@ -2284,12 +2145,6 @@
         <w:gridCol w:w="9360"/>
       </w:tblGrid>
       <w:tr>
-        <w:tblPrEx>
-          <w:tblCellMar>
-            <w:top w:w="0" w:type="dxa"/>
-            <w:bottom w:w="0" w:type="dxa"/>
-          </w:tblCellMar>
-        </w:tblPrEx>
         <w:tc>
           <w:tcPr>
             <w:tcW w:w="9360" w:type="dxa"/>
@@ -2492,12 +2347,6 @@
         <w:gridCol w:w="9360"/>
       </w:tblGrid>
       <w:tr>
-        <w:tblPrEx>
-          <w:tblCellMar>
-            <w:top w:w="0" w:type="dxa"/>
-            <w:bottom w:w="0" w:type="dxa"/>
-          </w:tblCellMar>
-        </w:tblPrEx>
         <w:tc>
           <w:tcPr>
             <w:tcW w:w="9360" w:type="dxa"/>
@@ -2648,12 +2497,6 @@
         <w:gridCol w:w="9360"/>
       </w:tblGrid>
       <w:tr>
-        <w:tblPrEx>
-          <w:tblCellMar>
-            <w:top w:w="0" w:type="dxa"/>
-            <w:bottom w:w="0" w:type="dxa"/>
-          </w:tblCellMar>
-        </w:tblPrEx>
         <w:tc>
           <w:tcPr>
             <w:tcW w:w="9360" w:type="dxa"/>
@@ -2890,12 +2733,6 @@
         <w:gridCol w:w="9360"/>
       </w:tblGrid>
       <w:tr>
-        <w:tblPrEx>
-          <w:tblCellMar>
-            <w:top w:w="0" w:type="dxa"/>
-            <w:bottom w:w="0" w:type="dxa"/>
-          </w:tblCellMar>
-        </w:tblPrEx>
         <w:tc>
           <w:tcPr>
             <w:tcW w:w="9360" w:type="dxa"/>
@@ -2976,12 +2813,6 @@
         <w:gridCol w:w="2160"/>
       </w:tblGrid>
       <w:tr>
-        <w:tblPrEx>
-          <w:tblCellMar>
-            <w:top w:w="0" w:type="dxa"/>
-            <w:bottom w:w="0" w:type="dxa"/>
-          </w:tblCellMar>
-        </w:tblPrEx>
         <w:tc>
           <w:tcPr>
             <w:tcW w:w="2000" w:type="dxa"/>
@@ -3104,12 +2935,6 @@
         </w:tc>
       </w:tr>
       <w:tr>
-        <w:tblPrEx>
-          <w:tblCellMar>
-            <w:top w:w="0" w:type="dxa"/>
-            <w:bottom w:w="0" w:type="dxa"/>
-          </w:tblCellMar>
-        </w:tblPrEx>
         <w:tc>
           <w:tcPr>
             <w:tcW w:w="2000" w:type="dxa"/>
@@ -3224,12 +3049,6 @@
         </w:tc>
       </w:tr>
       <w:tr>
-        <w:tblPrEx>
-          <w:tblCellMar>
-            <w:top w:w="0" w:type="dxa"/>
-            <w:bottom w:w="0" w:type="dxa"/>
-          </w:tblCellMar>
-        </w:tblPrEx>
         <w:tc>
           <w:tcPr>
             <w:tcW w:w="2000" w:type="dxa"/>
@@ -3378,12 +3197,6 @@
         <w:gridCol w:w="9360"/>
       </w:tblGrid>
       <w:tr>
-        <w:tblPrEx>
-          <w:tblCellMar>
-            <w:top w:w="0" w:type="dxa"/>
-            <w:bottom w:w="0" w:type="dxa"/>
-          </w:tblCellMar>
-        </w:tblPrEx>
         <w:tc>
           <w:tcPr>
             <w:tcW w:w="9360" w:type="dxa"/>
@@ -3453,12 +3266,6 @@
         <w:gridCol w:w="9360"/>
       </w:tblGrid>
       <w:tr>
-        <w:tblPrEx>
-          <w:tblCellMar>
-            <w:top w:w="0" w:type="dxa"/>
-            <w:bottom w:w="0" w:type="dxa"/>
-          </w:tblCellMar>
-        </w:tblPrEx>
         <w:tc>
           <w:tcPr>
             <w:tcW w:w="9360" w:type="dxa"/>
@@ -3827,12 +3634,6 @@
         <w:gridCol w:w="9360"/>
       </w:tblGrid>
       <w:tr>
-        <w:tblPrEx>
-          <w:tblCellMar>
-            <w:top w:w="0" w:type="dxa"/>
-            <w:bottom w:w="0" w:type="dxa"/>
-          </w:tblCellMar>
-        </w:tblPrEx>
         <w:tc>
           <w:tcPr>
             <w:tcW w:w="9360" w:type="dxa"/>
@@ -4514,12 +4315,6 @@
         <w:gridCol w:w="9360"/>
       </w:tblGrid>
       <w:tr>
-        <w:tblPrEx>
-          <w:tblCellMar>
-            <w:top w:w="0" w:type="dxa"/>
-            <w:bottom w:w="0" w:type="dxa"/>
-          </w:tblCellMar>
-        </w:tblPrEx>
         <w:tc>
           <w:tcPr>
             <w:tcW w:w="9360" w:type="dxa"/>
@@ -4966,7 +4761,7 @@
                 <w:sz w:val="18"/>
                 <w:szCs w:val="18"/>
               </w:rPr>
-              <w:t xml:space="preserve">    { string key = 1; string value = </w:t>
+              <w:t xml:space="preserve"> </w:t>
             </w:r>
             <w:proofErr w:type="gramStart"/>
             <w:r>
@@ -4976,9 +4771,29 @@
                 <w:sz w:val="18"/>
                 <w:szCs w:val="18"/>
               </w:rPr>
-              <w:t>2; }</w:t>
+              <w:t xml:space="preserve">   {</w:t>
             </w:r>
             <w:proofErr w:type="gramEnd"/>
+            <w:r>
+              <w:rPr>
+                <w:rFonts w:ascii="Courier New" w:eastAsia="Courier New" w:hAnsi="Courier New" w:cs="Courier New"/>
+                <w:color w:val="D4D4D4"/>
+                <w:sz w:val="18"/>
+                <w:szCs w:val="18"/>
+              </w:rPr>
+              <w:t xml:space="preserve"> string key = 1; string value = 2</w:t>
+            </w:r>
+            <w:proofErr w:type="gramStart"/>
+            <w:r>
+              <w:rPr>
+                <w:rFonts w:ascii="Courier New" w:eastAsia="Courier New" w:hAnsi="Courier New" w:cs="Courier New"/>
+                <w:color w:val="D4D4D4"/>
+                <w:sz w:val="18"/>
+                <w:szCs w:val="18"/>
+              </w:rPr>
+              <w:t>; }</w:t>
+            </w:r>
+            <w:proofErr w:type="gramEnd"/>
           </w:p>
           <w:p>
             <w:r>
@@ -5001,15 +4816,6 @@
               <w:t>PutResponse</w:t>
             </w:r>
             <w:proofErr w:type="spellEnd"/>
-            <w:r>
-              <w:rPr>
-                <w:rFonts w:ascii="Courier New" w:eastAsia="Courier New" w:hAnsi="Courier New" w:cs="Courier New"/>
-                <w:color w:val="D4D4D4"/>
-                <w:sz w:val="18"/>
-                <w:szCs w:val="18"/>
-              </w:rPr>
-              <w:t xml:space="preserve">   { bool success = </w:t>
-            </w:r>
             <w:proofErr w:type="gramStart"/>
             <w:r>
               <w:rPr>
@@ -5018,9 +4824,29 @@
                 <w:sz w:val="18"/>
                 <w:szCs w:val="18"/>
               </w:rPr>
-              <w:t>1; }</w:t>
+              <w:t xml:space="preserve">   {</w:t>
             </w:r>
             <w:proofErr w:type="gramEnd"/>
+            <w:r>
+              <w:rPr>
+                <w:rFonts w:ascii="Courier New" w:eastAsia="Courier New" w:hAnsi="Courier New" w:cs="Courier New"/>
+                <w:color w:val="D4D4D4"/>
+                <w:sz w:val="18"/>
+                <w:szCs w:val="18"/>
+              </w:rPr>
+              <w:t xml:space="preserve"> bool success = 1</w:t>
+            </w:r>
+            <w:proofErr w:type="gramStart"/>
+            <w:r>
+              <w:rPr>
+                <w:rFonts w:ascii="Courier New" w:eastAsia="Courier New" w:hAnsi="Courier New" w:cs="Courier New"/>
+                <w:color w:val="D4D4D4"/>
+                <w:sz w:val="18"/>
+                <w:szCs w:val="18"/>
+              </w:rPr>
+              <w:t>; }</w:t>
+            </w:r>
+            <w:proofErr w:type="gramEnd"/>
           </w:p>
           <w:p>
             <w:r>
@@ -5050,7 +4876,7 @@
                 <w:sz w:val="18"/>
                 <w:szCs w:val="18"/>
               </w:rPr>
-              <w:t xml:space="preserve">    { string key = </w:t>
+              <w:t xml:space="preserve"> </w:t>
             </w:r>
             <w:proofErr w:type="gramStart"/>
             <w:r>
@@ -5060,9 +4886,29 @@
                 <w:sz w:val="18"/>
                 <w:szCs w:val="18"/>
               </w:rPr>
-              <w:t>1; }</w:t>
+              <w:t xml:space="preserve">   {</w:t>
             </w:r>
             <w:proofErr w:type="gramEnd"/>
+            <w:r>
+              <w:rPr>
+                <w:rFonts w:ascii="Courier New" w:eastAsia="Courier New" w:hAnsi="Courier New" w:cs="Courier New"/>
+                <w:color w:val="D4D4D4"/>
+                <w:sz w:val="18"/>
+                <w:szCs w:val="18"/>
+              </w:rPr>
+              <w:t xml:space="preserve"> string key = 1</w:t>
+            </w:r>
+            <w:proofErr w:type="gramStart"/>
+            <w:r>
+              <w:rPr>
+                <w:rFonts w:ascii="Courier New" w:eastAsia="Courier New" w:hAnsi="Courier New" w:cs="Courier New"/>
+                <w:color w:val="D4D4D4"/>
+                <w:sz w:val="18"/>
+                <w:szCs w:val="18"/>
+              </w:rPr>
+              <w:t>; }</w:t>
+            </w:r>
+            <w:proofErr w:type="gramEnd"/>
           </w:p>
           <w:p>
             <w:r>
@@ -5085,15 +4931,6 @@
               <w:t>GetResponse</w:t>
             </w:r>
             <w:proofErr w:type="spellEnd"/>
-            <w:r>
-              <w:rPr>
-                <w:rFonts w:ascii="Courier New" w:eastAsia="Courier New" w:hAnsi="Courier New" w:cs="Courier New"/>
-                <w:color w:val="D4D4D4"/>
-                <w:sz w:val="18"/>
-                <w:szCs w:val="18"/>
-              </w:rPr>
-              <w:t xml:space="preserve">   { string value = 1; bool found = </w:t>
-            </w:r>
             <w:proofErr w:type="gramStart"/>
             <w:r>
               <w:rPr>
@@ -5102,9 +4939,29 @@
                 <w:sz w:val="18"/>
                 <w:szCs w:val="18"/>
               </w:rPr>
-              <w:t>2; }</w:t>
+              <w:t xml:space="preserve">   {</w:t>
             </w:r>
             <w:proofErr w:type="gramEnd"/>
+            <w:r>
+              <w:rPr>
+                <w:rFonts w:ascii="Courier New" w:eastAsia="Courier New" w:hAnsi="Courier New" w:cs="Courier New"/>
+                <w:color w:val="D4D4D4"/>
+                <w:sz w:val="18"/>
+                <w:szCs w:val="18"/>
+              </w:rPr>
+              <w:t xml:space="preserve"> string value = 1; bool found = 2</w:t>
+            </w:r>
+            <w:proofErr w:type="gramStart"/>
+            <w:r>
+              <w:rPr>
+                <w:rFonts w:ascii="Courier New" w:eastAsia="Courier New" w:hAnsi="Courier New" w:cs="Courier New"/>
+                <w:color w:val="D4D4D4"/>
+                <w:sz w:val="18"/>
+                <w:szCs w:val="18"/>
+              </w:rPr>
+              <w:t>; }</w:t>
+            </w:r>
+            <w:proofErr w:type="gramEnd"/>
           </w:p>
           <w:p>
             <w:r>
@@ -5134,7 +4991,7 @@
                 <w:sz w:val="18"/>
                 <w:szCs w:val="18"/>
               </w:rPr>
-              <w:t xml:space="preserve"> { string key = </w:t>
+              <w:t xml:space="preserve"> </w:t>
             </w:r>
             <w:proofErr w:type="gramStart"/>
             <w:r>
@@ -5144,9 +5001,29 @@
                 <w:sz w:val="18"/>
                 <w:szCs w:val="18"/>
               </w:rPr>
-              <w:t>1; }</w:t>
+              <w:t>{ string</w:t>
             </w:r>
             <w:proofErr w:type="gramEnd"/>
+            <w:r>
+              <w:rPr>
+                <w:rFonts w:ascii="Courier New" w:eastAsia="Courier New" w:hAnsi="Courier New" w:cs="Courier New"/>
+                <w:color w:val="D4D4D4"/>
+                <w:sz w:val="18"/>
+                <w:szCs w:val="18"/>
+              </w:rPr>
+              <w:t xml:space="preserve"> key = 1</w:t>
+            </w:r>
+            <w:proofErr w:type="gramStart"/>
+            <w:r>
+              <w:rPr>
+                <w:rFonts w:ascii="Courier New" w:eastAsia="Courier New" w:hAnsi="Courier New" w:cs="Courier New"/>
+                <w:color w:val="D4D4D4"/>
+                <w:sz w:val="18"/>
+                <w:szCs w:val="18"/>
+              </w:rPr>
+              <w:t>; }</w:t>
+            </w:r>
+            <w:proofErr w:type="gramEnd"/>
           </w:p>
           <w:p>
             <w:r>
@@ -5159,6 +5036,7 @@
               <w:t xml:space="preserve">message </w:t>
             </w:r>
             <w:proofErr w:type="spellStart"/>
+            <w:proofErr w:type="gramStart"/>
             <w:r>
               <w:rPr>
                 <w:rFonts w:ascii="Courier New" w:eastAsia="Courier New" w:hAnsi="Courier New" w:cs="Courier New"/>
@@ -5176,7 +5054,17 @@
                 <w:sz w:val="18"/>
                 <w:szCs w:val="18"/>
               </w:rPr>
-              <w:t xml:space="preserve">{ bool deleted = </w:t>
+              <w:t>{ bool</w:t>
+            </w:r>
+            <w:proofErr w:type="gramEnd"/>
+            <w:r>
+              <w:rPr>
+                <w:rFonts w:ascii="Courier New" w:eastAsia="Courier New" w:hAnsi="Courier New" w:cs="Courier New"/>
+                <w:color w:val="D4D4D4"/>
+                <w:sz w:val="18"/>
+                <w:szCs w:val="18"/>
+              </w:rPr>
+              <w:t xml:space="preserve"> deleted = 1</w:t>
             </w:r>
             <w:proofErr w:type="gramStart"/>
             <w:r>
@@ -5186,7 +5074,7 @@
                 <w:sz w:val="18"/>
                 <w:szCs w:val="18"/>
               </w:rPr>
-              <w:t>1; }</w:t>
+              <w:t>; }</w:t>
             </w:r>
             <w:proofErr w:type="gramEnd"/>
           </w:p>
@@ -5338,12 +5226,6 @@
         <w:gridCol w:w="4083"/>
       </w:tblGrid>
       <w:tr>
-        <w:tblPrEx>
-          <w:tblCellMar>
-            <w:top w:w="0" w:type="dxa"/>
-            <w:bottom w:w="0" w:type="dxa"/>
-          </w:tblCellMar>
-        </w:tblPrEx>
         <w:tc>
           <w:tcPr>
             <w:tcW w:w="2800" w:type="dxa"/>
@@ -5436,12 +5318,6 @@
         </w:tc>
       </w:tr>
       <w:tr>
-        <w:tblPrEx>
-          <w:tblCellMar>
-            <w:top w:w="0" w:type="dxa"/>
-            <w:bottom w:w="0" w:type="dxa"/>
-          </w:tblCellMar>
-        </w:tblPrEx>
         <w:tc>
           <w:tcPr>
             <w:tcW w:w="2800" w:type="dxa"/>
@@ -5620,12 +5496,6 @@
         </w:tc>
       </w:tr>
       <w:tr>
-        <w:tblPrEx>
-          <w:tblCellMar>
-            <w:top w:w="0" w:type="dxa"/>
-            <w:bottom w:w="0" w:type="dxa"/>
-          </w:tblCellMar>
-        </w:tblPrEx>
         <w:tc>
           <w:tcPr>
             <w:tcW w:w="2800" w:type="dxa"/>
@@ -5786,12 +5656,6 @@
         <w:gridCol w:w="9360"/>
       </w:tblGrid>
       <w:tr>
-        <w:tblPrEx>
-          <w:tblCellMar>
-            <w:top w:w="0" w:type="dxa"/>
-            <w:bottom w:w="0" w:type="dxa"/>
-          </w:tblCellMar>
-        </w:tblPrEx>
         <w:tc>
           <w:tcPr>
             <w:tcW w:w="9360" w:type="dxa"/>
@@ -6272,12 +6136,6 @@
         <w:gridCol w:w="9360"/>
       </w:tblGrid>
       <w:tr>
-        <w:tblPrEx>
-          <w:tblCellMar>
-            <w:top w:w="0" w:type="dxa"/>
-            <w:bottom w:w="0" w:type="dxa"/>
-          </w:tblCellMar>
-        </w:tblPrEx>
         <w:tc>
           <w:tcPr>
             <w:tcW w:w="9360" w:type="dxa"/>
@@ -6433,12 +6291,6 @@
         <w:gridCol w:w="9360"/>
       </w:tblGrid>
       <w:tr>
-        <w:tblPrEx>
-          <w:tblCellMar>
-            <w:top w:w="0" w:type="dxa"/>
-            <w:bottom w:w="0" w:type="dxa"/>
-          </w:tblCellMar>
-        </w:tblPrEx>
         <w:tc>
           <w:tcPr>
             <w:tcW w:w="9360" w:type="dxa"/>
@@ -6686,12 +6538,6 @@
         <w:gridCol w:w="8066"/>
       </w:tblGrid>
       <w:tr>
-        <w:tblPrEx>
-          <w:tblCellMar>
-            <w:top w:w="0" w:type="dxa"/>
-            <w:bottom w:w="0" w:type="dxa"/>
-          </w:tblCellMar>
-        </w:tblPrEx>
         <w:tc>
           <w:tcPr>
             <w:tcW w:w="520" w:type="dxa"/>
@@ -6902,12 +6748,6 @@
         <w:gridCol w:w="7914"/>
       </w:tblGrid>
       <w:tr>
-        <w:tblPrEx>
-          <w:tblCellMar>
-            <w:top w:w="0" w:type="dxa"/>
-            <w:bottom w:w="0" w:type="dxa"/>
-          </w:tblCellMar>
-        </w:tblPrEx>
         <w:tc>
           <w:tcPr>
             <w:tcW w:w="520" w:type="dxa"/>
@@ -7046,12 +6886,6 @@
         <w:gridCol w:w="8101"/>
       </w:tblGrid>
       <w:tr>
-        <w:tblPrEx>
-          <w:tblCellMar>
-            <w:top w:w="0" w:type="dxa"/>
-            <w:bottom w:w="0" w:type="dxa"/>
-          </w:tblCellMar>
-        </w:tblPrEx>
         <w:tc>
           <w:tcPr>
             <w:tcW w:w="520" w:type="dxa"/>
@@ -7239,12 +7073,6 @@
         <w:gridCol w:w="7834"/>
       </w:tblGrid>
       <w:tr>
-        <w:tblPrEx>
-          <w:tblCellMar>
-            <w:top w:w="0" w:type="dxa"/>
-            <w:bottom w:w="0" w:type="dxa"/>
-          </w:tblCellMar>
-        </w:tblPrEx>
         <w:tc>
           <w:tcPr>
             <w:tcW w:w="520" w:type="dxa"/>
@@ -7453,12 +7281,6 @@
         <w:gridCol w:w="6560"/>
       </w:tblGrid>
       <w:tr>
-        <w:tblPrEx>
-          <w:tblCellMar>
-            <w:top w:w="0" w:type="dxa"/>
-            <w:bottom w:w="0" w:type="dxa"/>
-          </w:tblCellMar>
-        </w:tblPrEx>
         <w:tc>
           <w:tcPr>
             <w:tcW w:w="2800" w:type="dxa"/>
@@ -7521,12 +7343,6 @@
         </w:tc>
       </w:tr>
       <w:tr>
-        <w:tblPrEx>
-          <w:tblCellMar>
-            <w:top w:w="0" w:type="dxa"/>
-            <w:bottom w:w="0" w:type="dxa"/>
-          </w:tblCellMar>
-        </w:tblPrEx>
         <w:tc>
           <w:tcPr>
             <w:tcW w:w="2800" w:type="dxa"/>
@@ -7574,6 +7390,7 @@
           </w:tcPr>
           <w:p>
             <w:proofErr w:type="spellStart"/>
+            <w:proofErr w:type="gramStart"/>
             <w:r>
               <w:rPr>
                 <w:color w:val="000000"/>
@@ -7583,6 +7400,7 @@
               <w:t>rpc.Register</w:t>
             </w:r>
             <w:proofErr w:type="spellEnd"/>
+            <w:proofErr w:type="gramEnd"/>
             <w:r>
               <w:rPr>
                 <w:color w:val="000000"/>
@@ -7613,12 +7431,6 @@
         </w:tc>
       </w:tr>
       <w:tr>
-        <w:tblPrEx>
-          <w:tblCellMar>
-            <w:top w:w="0" w:type="dxa"/>
-            <w:bottom w:w="0" w:type="dxa"/>
-          </w:tblCellMar>
-        </w:tblPrEx>
         <w:tc>
           <w:tcPr>
             <w:tcW w:w="2800" w:type="dxa"/>
@@ -7666,6 +7478,7 @@
           </w:tcPr>
           <w:p>
             <w:proofErr w:type="spellStart"/>
+            <w:proofErr w:type="gramStart"/>
             <w:r>
               <w:rPr>
                 <w:color w:val="000000"/>
@@ -7675,6 +7488,7 @@
               <w:t>client.Call</w:t>
             </w:r>
             <w:proofErr w:type="spellEnd"/>
+            <w:proofErr w:type="gramEnd"/>
             <w:r>
               <w:rPr>
                 <w:color w:val="000000"/>
@@ -7733,12 +7547,6 @@
         </w:tc>
       </w:tr>
       <w:tr>
-        <w:tblPrEx>
-          <w:tblCellMar>
-            <w:top w:w="0" w:type="dxa"/>
-            <w:bottom w:w="0" w:type="dxa"/>
-          </w:tblCellMar>
-        </w:tblPrEx>
         <w:tc>
           <w:tcPr>
             <w:tcW w:w="2800" w:type="dxa"/>
@@ -7799,12 +7607,6 @@
         </w:tc>
       </w:tr>
       <w:tr>
-        <w:tblPrEx>
-          <w:tblCellMar>
-            <w:top w:w="0" w:type="dxa"/>
-            <w:bottom w:w="0" w:type="dxa"/>
-          </w:tblCellMar>
-        </w:tblPrEx>
         <w:tc>
           <w:tcPr>
             <w:tcW w:w="2800" w:type="dxa"/>
@@ -7863,12 +7665,6 @@
         </w:tc>
       </w:tr>
       <w:tr>
-        <w:tblPrEx>
-          <w:tblCellMar>
-            <w:top w:w="0" w:type="dxa"/>
-            <w:bottom w:w="0" w:type="dxa"/>
-          </w:tblCellMar>
-        </w:tblPrEx>
         <w:tc>
           <w:tcPr>
             <w:tcW w:w="2800" w:type="dxa"/>
@@ -8005,12 +7801,6 @@
         <w:gridCol w:w="9360"/>
       </w:tblGrid>
       <w:tr>
-        <w:tblPrEx>
-          <w:tblCellMar>
-            <w:top w:w="0" w:type="dxa"/>
-            <w:bottom w:w="0" w:type="dxa"/>
-          </w:tblCellMar>
-        </w:tblPrEx>
         <w:tc>
           <w:tcPr>
             <w:tcW w:w="9360" w:type="dxa"/>
@@ -8527,12 +8317,6 @@
         <w:gridCol w:w="9360"/>
       </w:tblGrid>
       <w:tr>
-        <w:tblPrEx>
-          <w:tblCellMar>
-            <w:top w:w="0" w:type="dxa"/>
-            <w:bottom w:w="0" w:type="dxa"/>
-          </w:tblCellMar>
-        </w:tblPrEx>
         <w:tc>
           <w:tcPr>
             <w:tcW w:w="9360" w:type="dxa"/>
@@ -8777,12 +8561,6 @@
         <w:gridCol w:w="8261"/>
       </w:tblGrid>
       <w:tr>
-        <w:tblPrEx>
-          <w:tblCellMar>
-            <w:top w:w="0" w:type="dxa"/>
-            <w:bottom w:w="0" w:type="dxa"/>
-          </w:tblCellMar>
-        </w:tblPrEx>
         <w:tc>
           <w:tcPr>
             <w:tcW w:w="520" w:type="dxa"/>
@@ -8947,12 +8725,6 @@
         <w:gridCol w:w="7603"/>
       </w:tblGrid>
       <w:tr>
-        <w:tblPrEx>
-          <w:tblCellMar>
-            <w:top w:w="0" w:type="dxa"/>
-            <w:bottom w:w="0" w:type="dxa"/>
-          </w:tblCellMar>
-        </w:tblPrEx>
         <w:tc>
           <w:tcPr>
             <w:tcW w:w="520" w:type="dxa"/>
@@ -9127,12 +8899,6 @@
         <w:gridCol w:w="7745"/>
       </w:tblGrid>
       <w:tr>
-        <w:tblPrEx>
-          <w:tblCellMar>
-            <w:top w:w="0" w:type="dxa"/>
-            <w:bottom w:w="0" w:type="dxa"/>
-          </w:tblCellMar>
-        </w:tblPrEx>
         <w:tc>
           <w:tcPr>
             <w:tcW w:w="520" w:type="dxa"/>
@@ -9299,12 +9065,6 @@
         <w:gridCol w:w="8101"/>
       </w:tblGrid>
       <w:tr>
-        <w:tblPrEx>
-          <w:tblCellMar>
-            <w:top w:w="0" w:type="dxa"/>
-            <w:bottom w:w="0" w:type="dxa"/>
-          </w:tblCellMar>
-        </w:tblPrEx>
         <w:tc>
           <w:tcPr>
             <w:tcW w:w="520" w:type="dxa"/>
@@ -9542,12 +9302,6 @@
         <w:gridCol w:w="3580"/>
       </w:tblGrid>
       <w:tr>
-        <w:tblPrEx>
-          <w:tblCellMar>
-            <w:top w:w="0" w:type="dxa"/>
-            <w:bottom w:w="0" w:type="dxa"/>
-          </w:tblCellMar>
-        </w:tblPrEx>
         <w:tc>
           <w:tcPr>
             <w:tcW w:w="2200" w:type="dxa"/>
@@ -9643,12 +9397,6 @@
         </w:tc>
       </w:tr>
       <w:tr>
-        <w:tblPrEx>
-          <w:tblCellMar>
-            <w:top w:w="0" w:type="dxa"/>
-            <w:bottom w:w="0" w:type="dxa"/>
-          </w:tblCellMar>
-        </w:tblPrEx>
         <w:tc>
           <w:tcPr>
             <w:tcW w:w="2200" w:type="dxa"/>
@@ -9755,12 +9503,6 @@
         </w:tc>
       </w:tr>
       <w:tr>
-        <w:tblPrEx>
-          <w:tblCellMar>
-            <w:top w:w="0" w:type="dxa"/>
-            <w:bottom w:w="0" w:type="dxa"/>
-          </w:tblCellMar>
-        </w:tblPrEx>
         <w:tc>
           <w:tcPr>
             <w:tcW w:w="2200" w:type="dxa"/>
@@ -9857,12 +9599,6 @@
         </w:tc>
       </w:tr>
       <w:tr>
-        <w:tblPrEx>
-          <w:tblCellMar>
-            <w:top w:w="0" w:type="dxa"/>
-            <w:bottom w:w="0" w:type="dxa"/>
-          </w:tblCellMar>
-        </w:tblPrEx>
         <w:tc>
           <w:tcPr>
             <w:tcW w:w="2200" w:type="dxa"/>
@@ -9949,12 +9685,6 @@
         </w:tc>
       </w:tr>
       <w:tr>
-        <w:tblPrEx>
-          <w:tblCellMar>
-            <w:top w:w="0" w:type="dxa"/>
-            <w:bottom w:w="0" w:type="dxa"/>
-          </w:tblCellMar>
-        </w:tblPrEx>
         <w:tc>
           <w:tcPr>
             <w:tcW w:w="2200" w:type="dxa"/>
@@ -10133,12 +9863,6 @@
         </w:tc>
       </w:tr>
       <w:tr>
-        <w:tblPrEx>
-          <w:tblCellMar>
-            <w:top w:w="0" w:type="dxa"/>
-            <w:bottom w:w="0" w:type="dxa"/>
-          </w:tblCellMar>
-        </w:tblPrEx>
         <w:tc>
           <w:tcPr>
             <w:tcW w:w="2200" w:type="dxa"/>
@@ -10225,12 +9949,6 @@
         </w:tc>
       </w:tr>
       <w:tr>
-        <w:tblPrEx>
-          <w:tblCellMar>
-            <w:top w:w="0" w:type="dxa"/>
-            <w:bottom w:w="0" w:type="dxa"/>
-          </w:tblCellMar>
-        </w:tblPrEx>
         <w:tc>
           <w:tcPr>
             <w:tcW w:w="2200" w:type="dxa"/>
@@ -10317,12 +10035,6 @@
         </w:tc>
       </w:tr>
       <w:tr>
-        <w:tblPrEx>
-          <w:tblCellMar>
-            <w:top w:w="0" w:type="dxa"/>
-            <w:bottom w:w="0" w:type="dxa"/>
-          </w:tblCellMar>
-        </w:tblPrEx>
         <w:tc>
           <w:tcPr>
             <w:tcW w:w="2200" w:type="dxa"/>
@@ -10451,12 +10163,6 @@
         <w:gridCol w:w="9360"/>
       </w:tblGrid>
       <w:tr>
-        <w:tblPrEx>
-          <w:tblCellMar>
-            <w:top w:w="0" w:type="dxa"/>
-            <w:bottom w:w="0" w:type="dxa"/>
-          </w:tblCellMar>
-        </w:tblPrEx>
         <w:tc>
           <w:tcPr>
             <w:tcW w:w="9360" w:type="dxa"/>
@@ -10867,12 +10573,6 @@
         <w:gridCol w:w="9360"/>
       </w:tblGrid>
       <w:tr>
-        <w:tblPrEx>
-          <w:tblCellMar>
-            <w:top w:w="0" w:type="dxa"/>
-            <w:bottom w:w="0" w:type="dxa"/>
-          </w:tblCellMar>
-        </w:tblPrEx>
         <w:tc>
           <w:tcPr>
             <w:tcW w:w="9360" w:type="dxa"/>
@@ -11048,12 +10748,6 @@
         <w:gridCol w:w="1360"/>
       </w:tblGrid>
       <w:tr>
-        <w:tblPrEx>
-          <w:tblCellMar>
-            <w:top w:w="0" w:type="dxa"/>
-            <w:bottom w:w="0" w:type="dxa"/>
-          </w:tblCellMar>
-        </w:tblPrEx>
         <w:tc>
           <w:tcPr>
             <w:tcW w:w="1200" w:type="dxa"/>
@@ -11206,12 +10900,6 @@
         </w:tc>
       </w:tr>
       <w:tr>
-        <w:tblPrEx>
-          <w:tblCellMar>
-            <w:top w:w="0" w:type="dxa"/>
-            <w:bottom w:w="0" w:type="dxa"/>
-          </w:tblCellMar>
-        </w:tblPrEx>
         <w:tc>
           <w:tcPr>
             <w:tcW w:w="1200" w:type="dxa"/>
@@ -11372,12 +11060,6 @@
         </w:tc>
       </w:tr>
       <w:tr>
-        <w:tblPrEx>
-          <w:tblCellMar>
-            <w:top w:w="0" w:type="dxa"/>
-            <w:bottom w:w="0" w:type="dxa"/>
-          </w:tblCellMar>
-        </w:tblPrEx>
         <w:tc>
           <w:tcPr>
             <w:tcW w:w="1200" w:type="dxa"/>
@@ -11525,6 +11207,7 @@
               <w:t xml:space="preserve">, </w:t>
             </w:r>
             <w:proofErr w:type="spellStart"/>
+            <w:proofErr w:type="gramStart"/>
             <w:r>
               <w:rPr>
                 <w:color w:val="000000"/>
@@ -11534,6 +11217,7 @@
               <w:t>found:true</w:t>
             </w:r>
             <w:proofErr w:type="spellEnd"/>
+            <w:proofErr w:type="gramEnd"/>
             <w:r>
               <w:rPr>
                 <w:color w:val="000000"/>
@@ -11574,12 +11258,6 @@
         </w:tc>
       </w:tr>
       <w:tr>
-        <w:tblPrEx>
-          <w:tblCellMar>
-            <w:top w:w="0" w:type="dxa"/>
-            <w:bottom w:w="0" w:type="dxa"/>
-          </w:tblCellMar>
-        </w:tblPrEx>
         <w:tc>
           <w:tcPr>
             <w:tcW w:w="1200" w:type="dxa"/>
@@ -11750,12 +11428,6 @@
         </w:tc>
       </w:tr>
       <w:tr>
-        <w:tblPrEx>
-          <w:tblCellMar>
-            <w:top w:w="0" w:type="dxa"/>
-            <w:bottom w:w="0" w:type="dxa"/>
-          </w:tblCellMar>
-        </w:tblPrEx>
         <w:tc>
           <w:tcPr>
             <w:tcW w:w="1200" w:type="dxa"/>
@@ -11974,12 +11646,6 @@
         <w:gridCol w:w="7648"/>
       </w:tblGrid>
       <w:tr>
-        <w:tblPrEx>
-          <w:tblCellMar>
-            <w:top w:w="0" w:type="dxa"/>
-            <w:bottom w:w="0" w:type="dxa"/>
-          </w:tblCellMar>
-        </w:tblPrEx>
         <w:tc>
           <w:tcPr>
             <w:tcW w:w="520" w:type="dxa"/>
@@ -12177,12 +11843,6 @@
         <w:gridCol w:w="7648"/>
       </w:tblGrid>
       <w:tr>
-        <w:tblPrEx>
-          <w:tblCellMar>
-            <w:top w:w="0" w:type="dxa"/>
-            <w:bottom w:w="0" w:type="dxa"/>
-          </w:tblCellMar>
-        </w:tblPrEx>
         <w:tc>
           <w:tcPr>
             <w:tcW w:w="520" w:type="dxa"/>
@@ -12352,12 +12012,6 @@
         <w:gridCol w:w="7648"/>
       </w:tblGrid>
       <w:tr>
-        <w:tblPrEx>
-          <w:tblCellMar>
-            <w:top w:w="0" w:type="dxa"/>
-            <w:bottom w:w="0" w:type="dxa"/>
-          </w:tblCellMar>
-        </w:tblPrEx>
         <w:tc>
           <w:tcPr>
             <w:tcW w:w="520" w:type="dxa"/>
@@ -12533,12 +12187,6 @@
         <w:gridCol w:w="7648"/>
       </w:tblGrid>
       <w:tr>
-        <w:tblPrEx>
-          <w:tblCellMar>
-            <w:top w:w="0" w:type="dxa"/>
-            <w:bottom w:w="0" w:type="dxa"/>
-          </w:tblCellMar>
-        </w:tblPrEx>
         <w:tc>
           <w:tcPr>
             <w:tcW w:w="520" w:type="dxa"/>
@@ -12690,12 +12338,6 @@
         <w:gridCol w:w="7790"/>
       </w:tblGrid>
       <w:tr>
-        <w:tblPrEx>
-          <w:tblCellMar>
-            <w:top w:w="0" w:type="dxa"/>
-            <w:bottom w:w="0" w:type="dxa"/>
-          </w:tblCellMar>
-        </w:tblPrEx>
         <w:tc>
           <w:tcPr>
             <w:tcW w:w="520" w:type="dxa"/>
@@ -12852,12 +12494,6 @@
         <w:gridCol w:w="9360"/>
       </w:tblGrid>
       <w:tr>
-        <w:tblPrEx>
-          <w:tblCellMar>
-            <w:top w:w="0" w:type="dxa"/>
-            <w:bottom w:w="0" w:type="dxa"/>
-          </w:tblCellMar>
-        </w:tblPrEx>
         <w:tc>
           <w:tcPr>
             <w:tcW w:w="9360" w:type="dxa"/>
@@ -13057,12 +12693,6 @@
         <w:gridCol w:w="9360"/>
       </w:tblGrid>
       <w:tr>
-        <w:tblPrEx>
-          <w:tblCellMar>
-            <w:top w:w="0" w:type="dxa"/>
-            <w:bottom w:w="0" w:type="dxa"/>
-          </w:tblCellMar>
-        </w:tblPrEx>
         <w:tc>
           <w:tcPr>
             <w:tcW w:w="9360" w:type="dxa"/>
@@ -13288,12 +12918,6 @@
         <w:gridCol w:w="9360"/>
       </w:tblGrid>
       <w:tr>
-        <w:tblPrEx>
-          <w:tblCellMar>
-            <w:top w:w="0" w:type="dxa"/>
-            <w:bottom w:w="0" w:type="dxa"/>
-          </w:tblCellMar>
-        </w:tblPrEx>
         <w:tc>
           <w:tcPr>
             <w:tcW w:w="9360" w:type="dxa"/>
@@ -13475,12 +13099,6 @@
         <w:gridCol w:w="9360"/>
       </w:tblGrid>
       <w:tr>
-        <w:tblPrEx>
-          <w:tblCellMar>
-            <w:top w:w="0" w:type="dxa"/>
-            <w:bottom w:w="0" w:type="dxa"/>
-          </w:tblCellMar>
-        </w:tblPrEx>
         <w:tc>
           <w:tcPr>
             <w:tcW w:w="9360" w:type="dxa"/>
@@ -13561,12 +13179,6 @@
         <w:gridCol w:w="9360"/>
       </w:tblGrid>
       <w:tr>
-        <w:tblPrEx>
-          <w:tblCellMar>
-            <w:top w:w="0" w:type="dxa"/>
-            <w:bottom w:w="0" w:type="dxa"/>
-          </w:tblCellMar>
-        </w:tblPrEx>
         <w:tc>
           <w:tcPr>
             <w:tcW w:w="9360" w:type="dxa"/>
@@ -13794,12 +13406,6 @@
         <w:gridCol w:w="9360"/>
       </w:tblGrid>
       <w:tr>
-        <w:tblPrEx>
-          <w:tblCellMar>
-            <w:top w:w="0" w:type="dxa"/>
-            <w:bottom w:w="0" w:type="dxa"/>
-          </w:tblCellMar>
-        </w:tblPrEx>
         <w:tc>
           <w:tcPr>
             <w:tcW w:w="9360" w:type="dxa"/>
@@ -14018,12 +13624,6 @@
         <w:gridCol w:w="9360"/>
       </w:tblGrid>
       <w:tr>
-        <w:tblPrEx>
-          <w:tblCellMar>
-            <w:top w:w="0" w:type="dxa"/>
-            <w:bottom w:w="0" w:type="dxa"/>
-          </w:tblCellMar>
-        </w:tblPrEx>
         <w:tc>
           <w:tcPr>
             <w:tcW w:w="9360" w:type="dxa"/>
@@ -14056,12 +13656,6 @@
         </w:tc>
       </w:tr>
       <w:tr>
-        <w:tblPrEx>
-          <w:tblCellMar>
-            <w:top w:w="0" w:type="dxa"/>
-            <w:bottom w:w="0" w:type="dxa"/>
-          </w:tblCellMar>
-        </w:tblPrEx>
         <w:tc>
           <w:tcPr>
             <w:tcW w:w="9360" w:type="dxa"/>
@@ -14261,12 +13855,6 @@
         <w:gridCol w:w="9360"/>
       </w:tblGrid>
       <w:tr>
-        <w:tblPrEx>
-          <w:tblCellMar>
-            <w:top w:w="0" w:type="dxa"/>
-            <w:bottom w:w="0" w:type="dxa"/>
-          </w:tblCellMar>
-        </w:tblPrEx>
         <w:tc>
           <w:tcPr>
             <w:tcW w:w="9360" w:type="dxa"/>
@@ -14299,12 +13887,6 @@
         </w:tc>
       </w:tr>
       <w:tr>
-        <w:tblPrEx>
-          <w:tblCellMar>
-            <w:top w:w="0" w:type="dxa"/>
-            <w:bottom w:w="0" w:type="dxa"/>
-          </w:tblCellMar>
-        </w:tblPrEx>
         <w:tc>
           <w:tcPr>
             <w:tcW w:w="9360" w:type="dxa"/>
@@ -14462,12 +14044,6 @@
         <w:gridCol w:w="9360"/>
       </w:tblGrid>
       <w:tr>
-        <w:tblPrEx>
-          <w:tblCellMar>
-            <w:top w:w="0" w:type="dxa"/>
-            <w:bottom w:w="0" w:type="dxa"/>
-          </w:tblCellMar>
-        </w:tblPrEx>
         <w:tc>
           <w:tcPr>
             <w:tcW w:w="9360" w:type="dxa"/>
@@ -14500,12 +14076,6 @@
         </w:tc>
       </w:tr>
       <w:tr>
-        <w:tblPrEx>
-          <w:tblCellMar>
-            <w:top w:w="0" w:type="dxa"/>
-            <w:bottom w:w="0" w:type="dxa"/>
-          </w:tblCellMar>
-        </w:tblPrEx>
         <w:tc>
           <w:tcPr>
             <w:tcW w:w="9360" w:type="dxa"/>
@@ -14702,12 +14272,6 @@
         <w:gridCol w:w="9662"/>
       </w:tblGrid>
       <w:tr>
-        <w:tblPrEx>
-          <w:tblCellMar>
-            <w:top w:w="0" w:type="dxa"/>
-            <w:bottom w:w="0" w:type="dxa"/>
-          </w:tblCellMar>
-        </w:tblPrEx>
         <w:tc>
           <w:tcPr>
             <w:tcW w:w="9360" w:type="dxa"/>
@@ -14740,12 +14304,6 @@
         </w:tc>
       </w:tr>
       <w:tr>
-        <w:tblPrEx>
-          <w:tblCellMar>
-            <w:top w:w="0" w:type="dxa"/>
-            <w:bottom w:w="0" w:type="dxa"/>
-          </w:tblCellMar>
-        </w:tblPrEx>
         <w:tc>
           <w:tcPr>
             <w:tcW w:w="9360" w:type="dxa"/>
@@ -14795,12 +14353,6 @@
               <w:gridCol w:w="9360"/>
             </w:tblGrid>
             <w:tr>
-              <w:tblPrEx>
-                <w:tblCellMar>
-                  <w:top w:w="0" w:type="dxa"/>
-                  <w:bottom w:w="0" w:type="dxa"/>
-                </w:tblCellMar>
-              </w:tblPrEx>
               <w:tc>
                 <w:tcPr>
                   <w:tcW w:w="9360" w:type="dxa"/>
@@ -15293,12 +14845,6 @@
         <w:gridCol w:w="9360"/>
       </w:tblGrid>
       <w:tr>
-        <w:tblPrEx>
-          <w:tblCellMar>
-            <w:top w:w="0" w:type="dxa"/>
-            <w:bottom w:w="0" w:type="dxa"/>
-          </w:tblCellMar>
-        </w:tblPrEx>
         <w:tc>
           <w:tcPr>
             <w:tcW w:w="9360" w:type="dxa"/>
@@ -15328,12 +14874,6 @@
         </w:tc>
       </w:tr>
       <w:tr>
-        <w:tblPrEx>
-          <w:tblCellMar>
-            <w:top w:w="0" w:type="dxa"/>
-            <w:bottom w:w="0" w:type="dxa"/>
-          </w:tblCellMar>
-        </w:tblPrEx>
         <w:tc>
           <w:tcPr>
             <w:tcW w:w="9360" w:type="dxa"/>
@@ -15362,12 +14902,6 @@
         </w:tc>
       </w:tr>
       <w:tr>
-        <w:tblPrEx>
-          <w:tblCellMar>
-            <w:top w:w="0" w:type="dxa"/>
-            <w:bottom w:w="0" w:type="dxa"/>
-          </w:tblCellMar>
-        </w:tblPrEx>
         <w:tc>
           <w:tcPr>
             <w:tcW w:w="9360" w:type="dxa"/>
@@ -15396,12 +14930,6 @@
         </w:tc>
       </w:tr>
       <w:tr>
-        <w:tblPrEx>
-          <w:tblCellMar>
-            <w:top w:w="0" w:type="dxa"/>
-            <w:bottom w:w="0" w:type="dxa"/>
-          </w:tblCellMar>
-        </w:tblPrEx>
         <w:tc>
           <w:tcPr>
             <w:tcW w:w="9360" w:type="dxa"/>
@@ -15430,12 +14958,6 @@
         </w:tc>
       </w:tr>
       <w:tr>
-        <w:tblPrEx>
-          <w:tblCellMar>
-            <w:top w:w="0" w:type="dxa"/>
-            <w:bottom w:w="0" w:type="dxa"/>
-          </w:tblCellMar>
-        </w:tblPrEx>
         <w:tc>
           <w:tcPr>
             <w:tcW w:w="9360" w:type="dxa"/>
@@ -15464,12 +14986,6 @@
         </w:tc>
       </w:tr>
       <w:tr>
-        <w:tblPrEx>
-          <w:tblCellMar>
-            <w:top w:w="0" w:type="dxa"/>
-            <w:bottom w:w="0" w:type="dxa"/>
-          </w:tblCellMar>
-        </w:tblPrEx>
         <w:tc>
           <w:tcPr>
             <w:tcW w:w="9360" w:type="dxa"/>
@@ -15574,12 +15090,6 @@
         <w:gridCol w:w="9360"/>
       </w:tblGrid>
       <w:tr>
-        <w:tblPrEx>
-          <w:tblCellMar>
-            <w:top w:w="0" w:type="dxa"/>
-            <w:bottom w:w="0" w:type="dxa"/>
-          </w:tblCellMar>
-        </w:tblPrEx>
         <w:tc>
           <w:tcPr>
             <w:tcW w:w="9360" w:type="dxa"/>
@@ -15609,12 +15119,6 @@
         </w:tc>
       </w:tr>
       <w:tr>
-        <w:tblPrEx>
-          <w:tblCellMar>
-            <w:top w:w="0" w:type="dxa"/>
-            <w:bottom w:w="0" w:type="dxa"/>
-          </w:tblCellMar>
-        </w:tblPrEx>
         <w:tc>
           <w:tcPr>
             <w:tcW w:w="9360" w:type="dxa"/>
@@ -15643,12 +15147,6 @@
         </w:tc>
       </w:tr>
       <w:tr>
-        <w:tblPrEx>
-          <w:tblCellMar>
-            <w:top w:w="0" w:type="dxa"/>
-            <w:bottom w:w="0" w:type="dxa"/>
-          </w:tblCellMar>
-        </w:tblPrEx>
         <w:tc>
           <w:tcPr>
             <w:tcW w:w="9360" w:type="dxa"/>
@@ -15677,12 +15175,6 @@
         </w:tc>
       </w:tr>
       <w:tr>
-        <w:tblPrEx>
-          <w:tblCellMar>
-            <w:top w:w="0" w:type="dxa"/>
-            <w:bottom w:w="0" w:type="dxa"/>
-          </w:tblCellMar>
-        </w:tblPrEx>
         <w:tc>
           <w:tcPr>
             <w:tcW w:w="9360" w:type="dxa"/>
@@ -15711,12 +15203,6 @@
         </w:tc>
       </w:tr>
       <w:tr>
-        <w:tblPrEx>
-          <w:tblCellMar>
-            <w:top w:w="0" w:type="dxa"/>
-            <w:bottom w:w="0" w:type="dxa"/>
-          </w:tblCellMar>
-        </w:tblPrEx>
         <w:tc>
           <w:tcPr>
             <w:tcW w:w="9360" w:type="dxa"/>
@@ -15745,12 +15231,6 @@
         </w:tc>
       </w:tr>
       <w:tr>
-        <w:tblPrEx>
-          <w:tblCellMar>
-            <w:top w:w="0" w:type="dxa"/>
-            <w:bottom w:w="0" w:type="dxa"/>
-          </w:tblCellMar>
-        </w:tblPrEx>
         <w:tc>
           <w:tcPr>
             <w:tcW w:w="9360" w:type="dxa"/>
@@ -15841,12 +15321,6 @@
         <w:gridCol w:w="9360"/>
       </w:tblGrid>
       <w:tr>
-        <w:tblPrEx>
-          <w:tblCellMar>
-            <w:top w:w="0" w:type="dxa"/>
-            <w:bottom w:w="0" w:type="dxa"/>
-          </w:tblCellMar>
-        </w:tblPrEx>
         <w:tc>
           <w:tcPr>
             <w:tcW w:w="9360" w:type="dxa"/>
@@ -15876,12 +15350,6 @@
         </w:tc>
       </w:tr>
       <w:tr>
-        <w:tblPrEx>
-          <w:tblCellMar>
-            <w:top w:w="0" w:type="dxa"/>
-            <w:bottom w:w="0" w:type="dxa"/>
-          </w:tblCellMar>
-        </w:tblPrEx>
         <w:tc>
           <w:tcPr>
             <w:tcW w:w="9360" w:type="dxa"/>
@@ -15910,12 +15378,6 @@
         </w:tc>
       </w:tr>
       <w:tr>
-        <w:tblPrEx>
-          <w:tblCellMar>
-            <w:top w:w="0" w:type="dxa"/>
-            <w:bottom w:w="0" w:type="dxa"/>
-          </w:tblCellMar>
-        </w:tblPrEx>
         <w:tc>
           <w:tcPr>
             <w:tcW w:w="9360" w:type="dxa"/>
@@ -15944,12 +15406,6 @@
         </w:tc>
       </w:tr>
       <w:tr>
-        <w:tblPrEx>
-          <w:tblCellMar>
-            <w:top w:w="0" w:type="dxa"/>
-            <w:bottom w:w="0" w:type="dxa"/>
-          </w:tblCellMar>
-        </w:tblPrEx>
         <w:tc>
           <w:tcPr>
             <w:tcW w:w="9360" w:type="dxa"/>
@@ -15978,12 +15434,6 @@
         </w:tc>
       </w:tr>
       <w:tr>
-        <w:tblPrEx>
-          <w:tblCellMar>
-            <w:top w:w="0" w:type="dxa"/>
-            <w:bottom w:w="0" w:type="dxa"/>
-          </w:tblCellMar>
-        </w:tblPrEx>
         <w:tc>
           <w:tcPr>
             <w:tcW w:w="9360" w:type="dxa"/>
@@ -16012,12 +15462,6 @@
         </w:tc>
       </w:tr>
       <w:tr>
-        <w:tblPrEx>
-          <w:tblCellMar>
-            <w:top w:w="0" w:type="dxa"/>
-            <w:bottom w:w="0" w:type="dxa"/>
-          </w:tblCellMar>
-        </w:tblPrEx>
         <w:tc>
           <w:tcPr>
             <w:tcW w:w="9360" w:type="dxa"/>
@@ -16068,6 +15512,7 @@
         <w:t xml:space="preserve">In Labs 02 and 03 you used </w:t>
       </w:r>
       <w:proofErr w:type="spellStart"/>
+      <w:proofErr w:type="gramStart"/>
       <w:r>
         <w:rPr>
           <w:color w:val="000000"/>
@@ -16079,7 +15524,14 @@
         <w:rPr>
           <w:color w:val="000000"/>
         </w:rPr>
-        <w:t xml:space="preserve">() which </w:t>
+        <w:t>(</w:t>
+      </w:r>
+      <w:proofErr w:type="gramEnd"/>
+      <w:r>
+        <w:rPr>
+          <w:color w:val="000000"/>
+        </w:rPr>
+        <w:t xml:space="preserve">) which </w:t>
       </w:r>
       <w:proofErr w:type="gramStart"/>
       <w:r>
@@ -16150,12 +15602,6 @@
         <w:gridCol w:w="9360"/>
       </w:tblGrid>
       <w:tr>
-        <w:tblPrEx>
-          <w:tblCellMar>
-            <w:top w:w="0" w:type="dxa"/>
-            <w:bottom w:w="0" w:type="dxa"/>
-          </w:tblCellMar>
-        </w:tblPrEx>
         <w:tc>
           <w:tcPr>
             <w:tcW w:w="9360" w:type="dxa"/>
@@ -16185,12 +15631,6 @@
         </w:tc>
       </w:tr>
       <w:tr>
-        <w:tblPrEx>
-          <w:tblCellMar>
-            <w:top w:w="0" w:type="dxa"/>
-            <w:bottom w:w="0" w:type="dxa"/>
-          </w:tblCellMar>
-        </w:tblPrEx>
         <w:tc>
           <w:tcPr>
             <w:tcW w:w="9360" w:type="dxa"/>
@@ -16219,12 +15659,6 @@
         </w:tc>
       </w:tr>
       <w:tr>
-        <w:tblPrEx>
-          <w:tblCellMar>
-            <w:top w:w="0" w:type="dxa"/>
-            <w:bottom w:w="0" w:type="dxa"/>
-          </w:tblCellMar>
-        </w:tblPrEx>
         <w:tc>
           <w:tcPr>
             <w:tcW w:w="9360" w:type="dxa"/>
@@ -16253,12 +15687,6 @@
         </w:tc>
       </w:tr>
       <w:tr>
-        <w:tblPrEx>
-          <w:tblCellMar>
-            <w:top w:w="0" w:type="dxa"/>
-            <w:bottom w:w="0" w:type="dxa"/>
-          </w:tblCellMar>
-        </w:tblPrEx>
         <w:tc>
           <w:tcPr>
             <w:tcW w:w="9360" w:type="dxa"/>
@@ -16288,12 +15716,6 @@
         </w:tc>
       </w:tr>
       <w:tr>
-        <w:tblPrEx>
-          <w:tblCellMar>
-            <w:top w:w="0" w:type="dxa"/>
-            <w:bottom w:w="0" w:type="dxa"/>
-          </w:tblCellMar>
-        </w:tblPrEx>
         <w:tc>
           <w:tcPr>
             <w:tcW w:w="9360" w:type="dxa"/>
@@ -16322,12 +15744,6 @@
         </w:tc>
       </w:tr>
       <w:tr>
-        <w:tblPrEx>
-          <w:tblCellMar>
-            <w:top w:w="0" w:type="dxa"/>
-            <w:bottom w:w="0" w:type="dxa"/>
-          </w:tblCellMar>
-        </w:tblPrEx>
         <w:tc>
           <w:tcPr>
             <w:tcW w:w="9360" w:type="dxa"/>
@@ -16406,12 +15822,6 @@
         <w:gridCol w:w="2188"/>
       </w:tblGrid>
       <w:tr>
-        <w:tblPrEx>
-          <w:tblCellMar>
-            <w:top w:w="0" w:type="dxa"/>
-            <w:bottom w:w="0" w:type="dxa"/>
-          </w:tblCellMar>
-        </w:tblPrEx>
         <w:tc>
           <w:tcPr>
             <w:tcW w:w="2800" w:type="dxa"/>
@@ -16558,12 +15968,6 @@
         </w:tc>
       </w:tr>
       <w:tr>
-        <w:tblPrEx>
-          <w:tblCellMar>
-            <w:top w:w="0" w:type="dxa"/>
-            <w:bottom w:w="0" w:type="dxa"/>
-          </w:tblCellMar>
-        </w:tblPrEx>
         <w:tc>
           <w:tcPr>
             <w:tcW w:w="2800" w:type="dxa"/>
@@ -16647,7 +16051,11 @@
               <w:right w:w="150" w:type="dxa"/>
             </w:tcMar>
           </w:tcPr>
-          <w:p/>
+          <w:p>
+            <w:r>
+              <w:t>WORKED</w:t>
+            </w:r>
+          </w:p>
         </w:tc>
         <w:tc>
           <w:tcPr>
@@ -16666,16 +16074,14 @@
               <w:right w:w="150" w:type="dxa"/>
             </w:tcMar>
           </w:tcPr>
-          <w:p/>
+          <w:p>
+            <w:r>
+              <w:t>WORKED</w:t>
+            </w:r>
+          </w:p>
         </w:tc>
       </w:tr>
       <w:tr>
-        <w:tblPrEx>
-          <w:tblCellMar>
-            <w:top w:w="0" w:type="dxa"/>
-            <w:bottom w:w="0" w:type="dxa"/>
-          </w:tblCellMar>
-        </w:tblPrEx>
         <w:tc>
           <w:tcPr>
             <w:tcW w:w="2800" w:type="dxa"/>
@@ -16723,7 +16129,11 @@
               <w:right w:w="150" w:type="dxa"/>
             </w:tcMar>
           </w:tcPr>
-          <w:p/>
+          <w:p>
+            <w:r>
+              <w:t>WORKED</w:t>
+            </w:r>
+          </w:p>
         </w:tc>
         <w:tc>
           <w:tcPr>
@@ -16770,16 +16180,14 @@
               <w:right w:w="150" w:type="dxa"/>
             </w:tcMar>
           </w:tcPr>
-          <w:p/>
+          <w:p>
+            <w:r>
+              <w:t>WORKED</w:t>
+            </w:r>
+          </w:p>
         </w:tc>
       </w:tr>
       <w:tr>
-        <w:tblPrEx>
-          <w:tblCellMar>
-            <w:top w:w="0" w:type="dxa"/>
-            <w:bottom w:w="0" w:type="dxa"/>
-          </w:tblCellMar>
-        </w:tblPrEx>
         <w:tc>
           <w:tcPr>
             <w:tcW w:w="2800" w:type="dxa"/>
@@ -16825,7 +16233,11 @@
               <w:right w:w="150" w:type="dxa"/>
             </w:tcMar>
           </w:tcPr>
-          <w:p/>
+          <w:p>
+            <w:r>
+              <w:t>WORKED</w:t>
+            </w:r>
+          </w:p>
         </w:tc>
         <w:tc>
           <w:tcPr>
@@ -16844,7 +16256,11 @@
               <w:right w:w="150" w:type="dxa"/>
             </w:tcMar>
           </w:tcPr>
-          <w:p/>
+          <w:p>
+            <w:r>
+              <w:t>WORKED</w:t>
+            </w:r>
+          </w:p>
         </w:tc>
         <w:tc>
           <w:tcPr>
@@ -16914,12 +16330,6 @@
         <w:gridCol w:w="2360"/>
       </w:tblGrid>
       <w:tr>
-        <w:tblPrEx>
-          <w:tblCellMar>
-            <w:top w:w="0" w:type="dxa"/>
-            <w:bottom w:w="0" w:type="dxa"/>
-          </w:tblCellMar>
-        </w:tblPrEx>
         <w:tc>
           <w:tcPr>
             <w:tcW w:w="1600" w:type="dxa"/>
@@ -17072,12 +16482,6 @@
         </w:tc>
       </w:tr>
       <w:tr>
-        <w:tblPrEx>
-          <w:tblCellMar>
-            <w:top w:w="0" w:type="dxa"/>
-            <w:bottom w:w="0" w:type="dxa"/>
-          </w:tblCellMar>
-        </w:tblPrEx>
         <w:tc>
           <w:tcPr>
             <w:tcW w:w="1600" w:type="dxa"/>
@@ -17194,12 +16598,6 @@
         </w:tc>
       </w:tr>
       <w:tr>
-        <w:tblPrEx>
-          <w:tblCellMar>
-            <w:top w:w="0" w:type="dxa"/>
-            <w:bottom w:w="0" w:type="dxa"/>
-          </w:tblCellMar>
-        </w:tblPrEx>
         <w:tc>
           <w:tcPr>
             <w:tcW w:w="1600" w:type="dxa"/>
@@ -17308,12 +16706,6 @@
         </w:tc>
       </w:tr>
       <w:tr>
-        <w:tblPrEx>
-          <w:tblCellMar>
-            <w:top w:w="0" w:type="dxa"/>
-            <w:bottom w:w="0" w:type="dxa"/>
-          </w:tblCellMar>
-        </w:tblPrEx>
         <w:tc>
           <w:tcPr>
             <w:tcW w:w="1600" w:type="dxa"/>
@@ -17457,12 +16849,6 @@
         <w:gridCol w:w="2188"/>
       </w:tblGrid>
       <w:tr>
-        <w:tblPrEx>
-          <w:tblCellMar>
-            <w:top w:w="0" w:type="dxa"/>
-            <w:bottom w:w="0" w:type="dxa"/>
-          </w:tblCellMar>
-        </w:tblPrEx>
         <w:tc>
           <w:tcPr>
             <w:tcW w:w="2800" w:type="dxa"/>
@@ -17599,12 +16985,6 @@
         </w:tc>
       </w:tr>
       <w:tr>
-        <w:tblPrEx>
-          <w:tblCellMar>
-            <w:top w:w="0" w:type="dxa"/>
-            <w:bottom w:w="0" w:type="dxa"/>
-          </w:tblCellMar>
-        </w:tblPrEx>
         <w:tc>
           <w:tcPr>
             <w:tcW w:w="2800" w:type="dxa"/>
@@ -17692,12 +17072,6 @@
         </w:tc>
       </w:tr>
       <w:tr>
-        <w:tblPrEx>
-          <w:tblCellMar>
-            <w:top w:w="0" w:type="dxa"/>
-            <w:bottom w:w="0" w:type="dxa"/>
-          </w:tblCellMar>
-        </w:tblPrEx>
         <w:tc>
           <w:tcPr>
             <w:tcW w:w="2800" w:type="dxa"/>
@@ -17795,12 +17169,6 @@
         </w:tc>
       </w:tr>
       <w:tr>
-        <w:tblPrEx>
-          <w:tblCellMar>
-            <w:top w:w="0" w:type="dxa"/>
-            <w:bottom w:w="0" w:type="dxa"/>
-          </w:tblCellMar>
-        </w:tblPrEx>
         <w:tc>
           <w:tcPr>
             <w:tcW w:w="2800" w:type="dxa"/>
@@ -17888,12 +17256,6 @@
         </w:tc>
       </w:tr>
       <w:tr>
-        <w:tblPrEx>
-          <w:tblCellMar>
-            <w:top w:w="0" w:type="dxa"/>
-            <w:bottom w:w="0" w:type="dxa"/>
-          </w:tblCellMar>
-        </w:tblPrEx>
         <w:tc>
           <w:tcPr>
             <w:tcW w:w="2800" w:type="dxa"/>
@@ -17981,12 +17343,6 @@
         </w:tc>
       </w:tr>
       <w:tr>
-        <w:tblPrEx>
-          <w:tblCellMar>
-            <w:top w:w="0" w:type="dxa"/>
-            <w:bottom w:w="0" w:type="dxa"/>
-          </w:tblCellMar>
-        </w:tblPrEx>
         <w:tc>
           <w:tcPr>
             <w:tcW w:w="2800" w:type="dxa"/>
@@ -18077,6 +17433,10 @@
     <w:p>
       <w:r>
         <w:br w:type="page"/>
+      </w:r>
+      <w:r>
+        <w:lastRenderedPageBreak/>
+        <w:tab/>
       </w:r>
     </w:p>
     <w:p>
@@ -18087,7 +17447,6 @@
         </w:pBdr>
       </w:pPr>
       <w:r>
-        <w:lastRenderedPageBreak/>
         <w:t>Submission</w:t>
       </w:r>
     </w:p>
@@ -18114,12 +17473,6 @@
         <w:gridCol w:w="3160"/>
       </w:tblGrid>
       <w:tr>
-        <w:tblPrEx>
-          <w:tblCellMar>
-            <w:top w:w="0" w:type="dxa"/>
-            <w:bottom w:w="0" w:type="dxa"/>
-          </w:tblCellMar>
-        </w:tblPrEx>
         <w:tc>
           <w:tcPr>
             <w:tcW w:w="2800" w:type="dxa"/>
@@ -18212,12 +17565,6 @@
         </w:tc>
       </w:tr>
       <w:tr>
-        <w:tblPrEx>
-          <w:tblCellMar>
-            <w:top w:w="0" w:type="dxa"/>
-            <w:bottom w:w="0" w:type="dxa"/>
-          </w:tblCellMar>
-        </w:tblPrEx>
         <w:tc>
           <w:tcPr>
             <w:tcW w:w="2800" w:type="dxa"/>
@@ -18304,12 +17651,6 @@
         </w:tc>
       </w:tr>
       <w:tr>
-        <w:tblPrEx>
-          <w:tblCellMar>
-            <w:top w:w="0" w:type="dxa"/>
-            <w:bottom w:w="0" w:type="dxa"/>
-          </w:tblCellMar>
-        </w:tblPrEx>
         <w:tc>
           <w:tcPr>
             <w:tcW w:w="2800" w:type="dxa"/>
@@ -18440,12 +17781,6 @@
         <w:gridCol w:w="6160"/>
       </w:tblGrid>
       <w:tr>
-        <w:tblPrEx>
-          <w:tblCellMar>
-            <w:top w:w="0" w:type="dxa"/>
-            <w:bottom w:w="0" w:type="dxa"/>
-          </w:tblCellMar>
-        </w:tblPrEx>
         <w:tc>
           <w:tcPr>
             <w:tcW w:w="3200" w:type="dxa"/>
@@ -18508,12 +17843,6 @@
         </w:tc>
       </w:tr>
       <w:tr>
-        <w:tblPrEx>
-          <w:tblCellMar>
-            <w:top w:w="0" w:type="dxa"/>
-            <w:bottom w:w="0" w:type="dxa"/>
-          </w:tblCellMar>
-        </w:tblPrEx>
         <w:tc>
           <w:tcPr>
             <w:tcW w:w="3200" w:type="dxa"/>
@@ -18572,12 +17901,6 @@
         </w:tc>
       </w:tr>
       <w:tr>
-        <w:tblPrEx>
-          <w:tblCellMar>
-            <w:top w:w="0" w:type="dxa"/>
-            <w:bottom w:w="0" w:type="dxa"/>
-          </w:tblCellMar>
-        </w:tblPrEx>
         <w:tc>
           <w:tcPr>
             <w:tcW w:w="3200" w:type="dxa"/>
@@ -18672,12 +17995,6 @@
         </w:tc>
       </w:tr>
       <w:tr>
-        <w:tblPrEx>
-          <w:tblCellMar>
-            <w:top w:w="0" w:type="dxa"/>
-            <w:bottom w:w="0" w:type="dxa"/>
-          </w:tblCellMar>
-        </w:tblPrEx>
         <w:tc>
           <w:tcPr>
             <w:tcW w:w="3200" w:type="dxa"/>
@@ -18746,12 +18063,6 @@
         </w:tc>
       </w:tr>
       <w:tr>
-        <w:tblPrEx>
-          <w:tblCellMar>
-            <w:top w:w="0" w:type="dxa"/>
-            <w:bottom w:w="0" w:type="dxa"/>
-          </w:tblCellMar>
-        </w:tblPrEx>
         <w:tc>
           <w:tcPr>
             <w:tcW w:w="3200" w:type="dxa"/>
@@ -18856,12 +18167,6 @@
         </w:tc>
       </w:tr>
       <w:tr>
-        <w:tblPrEx>
-          <w:tblCellMar>
-            <w:top w:w="0" w:type="dxa"/>
-            <w:bottom w:w="0" w:type="dxa"/>
-          </w:tblCellMar>
-        </w:tblPrEx>
         <w:tc>
           <w:tcPr>
             <w:tcW w:w="3200" w:type="dxa"/>
@@ -18966,12 +18271,6 @@
         </w:tc>
       </w:tr>
       <w:tr>
-        <w:tblPrEx>
-          <w:tblCellMar>
-            <w:top w:w="0" w:type="dxa"/>
-            <w:bottom w:w="0" w:type="dxa"/>
-          </w:tblCellMar>
-        </w:tblPrEx>
         <w:tc>
           <w:tcPr>
             <w:tcW w:w="3200" w:type="dxa"/>
@@ -19048,12 +18347,6 @@
         </w:tc>
       </w:tr>
       <w:tr>
-        <w:tblPrEx>
-          <w:tblCellMar>
-            <w:top w:w="0" w:type="dxa"/>
-            <w:bottom w:w="0" w:type="dxa"/>
-          </w:tblCellMar>
-        </w:tblPrEx>
         <w:tc>
           <w:tcPr>
             <w:tcW w:w="3200" w:type="dxa"/>
@@ -19132,12 +18425,6 @@
         </w:tc>
       </w:tr>
       <w:tr>
-        <w:tblPrEx>
-          <w:tblCellMar>
-            <w:top w:w="0" w:type="dxa"/>
-            <w:bottom w:w="0" w:type="dxa"/>
-          </w:tblCellMar>
-        </w:tblPrEx>
         <w:tc>
           <w:tcPr>
             <w:tcW w:w="3200" w:type="dxa"/>
@@ -19214,12 +18501,6 @@
         </w:tc>
       </w:tr>
       <w:tr>
-        <w:tblPrEx>
-          <w:tblCellMar>
-            <w:top w:w="0" w:type="dxa"/>
-            <w:bottom w:w="0" w:type="dxa"/>
-          </w:tblCellMar>
-        </w:tblPrEx>
         <w:tc>
           <w:tcPr>
             <w:tcW w:w="3200" w:type="dxa"/>
@@ -19288,12 +18569,6 @@
         </w:tc>
       </w:tr>
       <w:tr>
-        <w:tblPrEx>
-          <w:tblCellMar>
-            <w:top w:w="0" w:type="dxa"/>
-            <w:bottom w:w="0" w:type="dxa"/>
-          </w:tblCellMar>
-        </w:tblPrEx>
         <w:tc>
           <w:tcPr>
             <w:tcW w:w="3200" w:type="dxa"/>
@@ -19352,12 +18627,6 @@
         </w:tc>
       </w:tr>
       <w:tr>
-        <w:tblPrEx>
-          <w:tblCellMar>
-            <w:top w:w="0" w:type="dxa"/>
-            <w:bottom w:w="0" w:type="dxa"/>
-          </w:tblCellMar>
-        </w:tblPrEx>
         <w:tc>
           <w:tcPr>
             <w:tcW w:w="3200" w:type="dxa"/>
@@ -19467,12 +18736,6 @@
         <w:gridCol w:w="9360"/>
       </w:tblGrid>
       <w:tr>
-        <w:tblPrEx>
-          <w:tblCellMar>
-            <w:top w:w="0" w:type="dxa"/>
-            <w:bottom w:w="0" w:type="dxa"/>
-          </w:tblCellMar>
-        </w:tblPrEx>
         <w:tc>
           <w:tcPr>
             <w:tcW w:w="9360" w:type="dxa"/>
@@ -19843,12 +19106,6 @@
         <w:gridCol w:w="9360"/>
       </w:tblGrid>
       <w:tr>
-        <w:tblPrEx>
-          <w:tblCellMar>
-            <w:top w:w="0" w:type="dxa"/>
-            <w:bottom w:w="0" w:type="dxa"/>
-          </w:tblCellMar>
-        </w:tblPrEx>
         <w:tc>
           <w:tcPr>
             <w:tcW w:w="9360" w:type="dxa"/>
@@ -20084,9 +19341,20 @@
                 <w:sz w:val="18"/>
                 <w:szCs w:val="18"/>
               </w:rPr>
-              <w:t>) Put(</w:t>
-            </w:r>
-            <w:proofErr w:type="spellStart"/>
+              <w:t xml:space="preserve">) </w:t>
+            </w:r>
+            <w:proofErr w:type="gramStart"/>
+            <w:r>
+              <w:rPr>
+                <w:rFonts w:ascii="Courier New" w:eastAsia="Courier New" w:hAnsi="Courier New" w:cs="Courier New"/>
+                <w:color w:val="D4D4D4"/>
+                <w:sz w:val="18"/>
+                <w:szCs w:val="18"/>
+              </w:rPr>
+              <w:t>Put(</w:t>
+            </w:r>
+            <w:proofErr w:type="spellStart"/>
+            <w:proofErr w:type="gramEnd"/>
             <w:r>
               <w:rPr>
                 <w:rFonts w:ascii="Courier New" w:eastAsia="Courier New" w:hAnsi="Courier New" w:cs="Courier New"/>
@@ -20107,6 +19375,7 @@
               <w:t xml:space="preserve"> </w:t>
             </w:r>
             <w:proofErr w:type="spellStart"/>
+            <w:proofErr w:type="gramStart"/>
             <w:r>
               <w:rPr>
                 <w:rFonts w:ascii="Courier New" w:eastAsia="Courier New" w:hAnsi="Courier New" w:cs="Courier New"/>
@@ -20117,6 +19386,7 @@
               <w:t>context.Context</w:t>
             </w:r>
             <w:proofErr w:type="spellEnd"/>
+            <w:proofErr w:type="gramEnd"/>
             <w:r>
               <w:rPr>
                 <w:rFonts w:ascii="Courier New" w:eastAsia="Courier New" w:hAnsi="Courier New" w:cs="Courier New"/>
@@ -20127,6 +19397,7 @@
               <w:t>, req *</w:t>
             </w:r>
             <w:proofErr w:type="spellStart"/>
+            <w:proofErr w:type="gramStart"/>
             <w:r>
               <w:rPr>
                 <w:rFonts w:ascii="Courier New" w:eastAsia="Courier New" w:hAnsi="Courier New" w:cs="Courier New"/>
@@ -20137,6 +19408,7 @@
               <w:t>pb.PutRequest</w:t>
             </w:r>
             <w:proofErr w:type="spellEnd"/>
+            <w:proofErr w:type="gramEnd"/>
             <w:r>
               <w:rPr>
                 <w:rFonts w:ascii="Courier New" w:eastAsia="Courier New" w:hAnsi="Courier New" w:cs="Courier New"/>
@@ -20147,6 +19419,7 @@
               <w:t>) (*</w:t>
             </w:r>
             <w:proofErr w:type="spellStart"/>
+            <w:proofErr w:type="gramStart"/>
             <w:r>
               <w:rPr>
                 <w:rFonts w:ascii="Courier New" w:eastAsia="Courier New" w:hAnsi="Courier New" w:cs="Courier New"/>
@@ -20157,6 +19430,7 @@
               <w:t>pb.PutResponse</w:t>
             </w:r>
             <w:proofErr w:type="spellEnd"/>
+            <w:proofErr w:type="gramEnd"/>
             <w:r>
               <w:rPr>
                 <w:rFonts w:ascii="Courier New" w:eastAsia="Courier New" w:hAnsi="Courier New" w:cs="Courier New"/>
@@ -20536,7 +19810,27 @@
                 <w:sz w:val="18"/>
                 <w:szCs w:val="18"/>
               </w:rPr>
-              <w:t xml:space="preserve"> cancel()</w:t>
+              <w:t xml:space="preserve"> </w:t>
+            </w:r>
+            <w:proofErr w:type="gramStart"/>
+            <w:r>
+              <w:rPr>
+                <w:rFonts w:ascii="Courier New" w:eastAsia="Courier New" w:hAnsi="Courier New" w:cs="Courier New"/>
+                <w:color w:val="D4D4D4"/>
+                <w:sz w:val="18"/>
+                <w:szCs w:val="18"/>
+              </w:rPr>
+              <w:t>cancel(</w:t>
+            </w:r>
+            <w:proofErr w:type="gramEnd"/>
+            <w:r>
+              <w:rPr>
+                <w:rFonts w:ascii="Courier New" w:eastAsia="Courier New" w:hAnsi="Courier New" w:cs="Courier New"/>
+                <w:color w:val="D4D4D4"/>
+                <w:sz w:val="18"/>
+                <w:szCs w:val="18"/>
+              </w:rPr>
+              <w:t>)</w:t>
             </w:r>
           </w:p>
           <w:p>
@@ -20647,12 +19941,6 @@
         <w:gridCol w:w="9360"/>
       </w:tblGrid>
       <w:tr>
-        <w:tblPrEx>
-          <w:tblCellMar>
-            <w:top w:w="0" w:type="dxa"/>
-            <w:bottom w:w="0" w:type="dxa"/>
-          </w:tblCellMar>
-        </w:tblPrEx>
         <w:tc>
           <w:tcPr>
             <w:tcW w:w="9360" w:type="dxa"/>
@@ -20990,6 +20278,7 @@
           </w:p>
           <w:p>
             <w:proofErr w:type="spellStart"/>
+            <w:proofErr w:type="gramStart"/>
             <w:r>
               <w:rPr>
                 <w:rFonts w:ascii="Courier New" w:eastAsia="Courier New" w:hAnsi="Courier New" w:cs="Courier New"/>
@@ -21000,14 +20289,15 @@
               <w:t>json.NewEncoder</w:t>
             </w:r>
             <w:proofErr w:type="spellEnd"/>
-            <w:r>
-              <w:rPr>
-                <w:rFonts w:ascii="Courier New" w:eastAsia="Courier New" w:hAnsi="Courier New" w:cs="Courier New"/>
-                <w:color w:val="D4D4D4"/>
-                <w:sz w:val="18"/>
-                <w:szCs w:val="18"/>
-              </w:rPr>
-              <w:t>(w).Encode(map[string]</w:t>
+            <w:proofErr w:type="gramEnd"/>
+            <w:r>
+              <w:rPr>
+                <w:rFonts w:ascii="Courier New" w:eastAsia="Courier New" w:hAnsi="Courier New" w:cs="Courier New"/>
+                <w:color w:val="D4D4D4"/>
+                <w:sz w:val="18"/>
+                <w:szCs w:val="18"/>
+              </w:rPr>
+              <w:t>(w</w:t>
             </w:r>
             <w:proofErr w:type="gramStart"/>
             <w:r>
@@ -21017,7 +20307,7 @@
                 <w:sz w:val="18"/>
                 <w:szCs w:val="18"/>
               </w:rPr>
-              <w:t>bool{"</w:t>
+              <w:t>).Encode</w:t>
             </w:r>
             <w:proofErr w:type="gramEnd"/>
             <w:r>
@@ -21027,7 +20317,27 @@
                 <w:sz w:val="18"/>
                 <w:szCs w:val="18"/>
               </w:rPr>
-              <w:t xml:space="preserve">success": </w:t>
+              <w:t>(map[string]</w:t>
+            </w:r>
+            <w:proofErr w:type="gramStart"/>
+            <w:r>
+              <w:rPr>
+                <w:rFonts w:ascii="Courier New" w:eastAsia="Courier New" w:hAnsi="Courier New" w:cs="Courier New"/>
+                <w:color w:val="D4D4D4"/>
+                <w:sz w:val="18"/>
+                <w:szCs w:val="18"/>
+              </w:rPr>
+              <w:t>bool{</w:t>
+            </w:r>
+            <w:proofErr w:type="gramEnd"/>
+            <w:r>
+              <w:rPr>
+                <w:rFonts w:ascii="Courier New" w:eastAsia="Courier New" w:hAnsi="Courier New" w:cs="Courier New"/>
+                <w:color w:val="D4D4D4"/>
+                <w:sz w:val="18"/>
+                <w:szCs w:val="18"/>
+              </w:rPr>
+              <w:t xml:space="preserve">"success": </w:t>
             </w:r>
             <w:proofErr w:type="gramStart"/>
             <w:r>
@@ -21309,12 +20619,6 @@
         <w:gridCol w:w="9360"/>
       </w:tblGrid>
       <w:tr>
-        <w:tblPrEx>
-          <w:tblCellMar>
-            <w:top w:w="0" w:type="dxa"/>
-            <w:bottom w:w="0" w:type="dxa"/>
-          </w:tblCellMar>
-        </w:tblPrEx>
         <w:tc>
           <w:tcPr>
             <w:tcW w:w="9360" w:type="dxa"/>
@@ -21351,9 +20655,30 @@
                 <w:sz w:val="18"/>
                 <w:szCs w:val="18"/>
               </w:rPr>
-              <w:t xml:space="preserve">body, _ := </w:t>
-            </w:r>
-            <w:proofErr w:type="spellStart"/>
+              <w:t xml:space="preserve">body, </w:t>
+            </w:r>
+            <w:proofErr w:type="gramStart"/>
+            <w:r>
+              <w:rPr>
+                <w:rFonts w:ascii="Courier New" w:eastAsia="Courier New" w:hAnsi="Courier New" w:cs="Courier New"/>
+                <w:color w:val="D4D4D4"/>
+                <w:sz w:val="18"/>
+                <w:szCs w:val="18"/>
+              </w:rPr>
+              <w:t>_ :</w:t>
+            </w:r>
+            <w:proofErr w:type="gramEnd"/>
+            <w:r>
+              <w:rPr>
+                <w:rFonts w:ascii="Courier New" w:eastAsia="Courier New" w:hAnsi="Courier New" w:cs="Courier New"/>
+                <w:color w:val="D4D4D4"/>
+                <w:sz w:val="18"/>
+                <w:szCs w:val="18"/>
+              </w:rPr>
+              <w:t xml:space="preserve">= </w:t>
+            </w:r>
+            <w:proofErr w:type="spellStart"/>
+            <w:proofErr w:type="gramStart"/>
             <w:r>
               <w:rPr>
                 <w:rFonts w:ascii="Courier New" w:eastAsia="Courier New" w:hAnsi="Courier New" w:cs="Courier New"/>
@@ -21364,6 +20689,7 @@
               <w:t>json.Marshal</w:t>
             </w:r>
             <w:proofErr w:type="spellEnd"/>
+            <w:proofErr w:type="gramEnd"/>
             <w:r>
               <w:rPr>
                 <w:rFonts w:ascii="Courier New" w:eastAsia="Courier New" w:hAnsi="Courier New" w:cs="Courier New"/>
@@ -21381,7 +20707,7 @@
                 <w:sz w:val="18"/>
                 <w:szCs w:val="18"/>
               </w:rPr>
-              <w:t>string{"</w:t>
+              <w:t>string{</w:t>
             </w:r>
             <w:proofErr w:type="gramEnd"/>
             <w:r>
@@ -21391,7 +20717,7 @@
                 <w:sz w:val="18"/>
                 <w:szCs w:val="18"/>
               </w:rPr>
-              <w:t xml:space="preserve">value": </w:t>
+              <w:t xml:space="preserve">"value": </w:t>
             </w:r>
             <w:proofErr w:type="gramStart"/>
             <w:r>
@@ -21643,6 +20969,16 @@
             </w:r>
           </w:p>
           <w:p>
+            <w:r>
+              <w:rPr>
+                <w:rFonts w:ascii="Courier New" w:eastAsia="Courier New" w:hAnsi="Courier New" w:cs="Courier New"/>
+                <w:color w:val="D4D4D4"/>
+                <w:sz w:val="18"/>
+                <w:szCs w:val="18"/>
+              </w:rPr>
+              <w:t xml:space="preserve">defer </w:t>
+            </w:r>
+            <w:proofErr w:type="spellStart"/>
             <w:proofErr w:type="gramStart"/>
             <w:r>
               <w:rPr>
@@ -21651,29 +20987,10 @@
                 <w:sz w:val="18"/>
                 <w:szCs w:val="18"/>
               </w:rPr>
-              <w:t xml:space="preserve">defer </w:t>
-            </w:r>
-            <w:proofErr w:type="spellStart"/>
-            <w:r>
-              <w:rPr>
-                <w:rFonts w:ascii="Courier New" w:eastAsia="Courier New" w:hAnsi="Courier New" w:cs="Courier New"/>
-                <w:color w:val="D4D4D4"/>
-                <w:sz w:val="18"/>
-                <w:szCs w:val="18"/>
-              </w:rPr>
-              <w:t>resp</w:t>
-            </w:r>
+              <w:t>resp.Body.Close</w:t>
+            </w:r>
+            <w:proofErr w:type="spellEnd"/>
             <w:proofErr w:type="gramEnd"/>
-            <w:r>
-              <w:rPr>
-                <w:rFonts w:ascii="Courier New" w:eastAsia="Courier New" w:hAnsi="Courier New" w:cs="Courier New"/>
-                <w:color w:val="D4D4D4"/>
-                <w:sz w:val="18"/>
-                <w:szCs w:val="18"/>
-              </w:rPr>
-              <w:t>.Body.Close</w:t>
-            </w:r>
-            <w:proofErr w:type="spellEnd"/>
             <w:r>
               <w:rPr>
                 <w:rFonts w:ascii="Courier New" w:eastAsia="Courier New" w:hAnsi="Courier New" w:cs="Courier New"/>
@@ -22038,7 +21355,25 @@
         <w:sz w:val="18"/>
         <w:szCs w:val="18"/>
       </w:rPr>
-      <w:t>Distributed Computing  |  Lab 04 — RPC and Web Services</w:t>
+      <w:t xml:space="preserve">Distributed </w:t>
+    </w:r>
+    <w:proofErr w:type="gramStart"/>
+    <w:r>
+      <w:rPr>
+        <w:color w:val="555555"/>
+        <w:sz w:val="18"/>
+        <w:szCs w:val="18"/>
+      </w:rPr>
+      <w:t>Computing  |</w:t>
+    </w:r>
+    <w:proofErr w:type="gramEnd"/>
+    <w:r>
+      <w:rPr>
+        <w:color w:val="555555"/>
+        <w:sz w:val="18"/>
+        <w:szCs w:val="18"/>
+      </w:rPr>
+      <w:t xml:space="preserve">  Lab 04 — RPC and Web Services</w:t>
     </w:r>
   </w:p>
 </w:hdr>

</xml_diff>